<commit_message>
docs: add Sky East Buy Plan Only Accounts section to user guide (v2.27.2)
- Added a new "Buy Plan Only Accounts" section to all three Sky East
  User Guide versions (bilingual, EN, ZH) describing the restricted
  role's actual current screen: a single Sky East tab, only New
  Contracts + Generate/Export sub-tabs, and Generate/Export skipping
  the output-type picker to go straight to Buy Plan + 核料
- Added a "which section applies to me" callout near the top so
  readers land on the right walkthrough for their account type
- fix: Step 4 of the existing guide was stale — it claimed the New
  Contracts "Process" button generates the Buy Plan/核料 workbooks
  directly. That moved to the separate Generate/Export sub-tab; the
  button itself is now named "Process Sky East Files" and only saves
  the contract. Corrected in all three guide versions

Co-Authored-By: Claude Fable 5 <noreply@anthropic.com>
</commit_message>
<xml_diff>
--- a/docs/Sky_East_User_Guide.docx
+++ b/docs/Sky_East_User_Guide.docx
@@ -154,6 +154,100 @@
       <w:pPr>
         <w:spacing w:after="0" w:before="0"/>
         <w:jc w:val="center"/>
+      </w:pPr>
+    </w:p>
+    <w:tbl>
+      <w:tblPr>
+        <w:tblW w:type="dxa" w:w="9746"/>
+        <w:tblBorders>
+          <w:top w:val="single" w:color="auto" w:sz="4"/>
+          <w:left w:val="single" w:color="auto" w:sz="4"/>
+          <w:bottom w:val="single" w:color="auto" w:sz="4"/>
+          <w:right w:val="single" w:color="auto" w:sz="4"/>
+          <w:insideH w:val="single" w:color="auto" w:sz="4"/>
+          <w:insideV w:val="single" w:color="auto" w:sz="4"/>
+        </w:tblBorders>
+      </w:tblPr>
+      <w:tblGrid>
+        <w:gridCol w:w="9746"/>
+      </w:tblGrid>
+      <w:tr>
+        <w:tc>
+          <w:tcPr>
+            <w:tcW w:type="dxa" w:w="9746"/>
+            <w:tcBorders>
+              <w:top w:val="single" w:color="5B9BD5" w:sz="1"/>
+              <w:left w:val="thick" w:color="2C5F8A" w:sz="8"/>
+              <w:bottom w:val="single" w:color="5B9BD5" w:sz="1"/>
+              <w:right w:val="single" w:color="5B9BD5" w:sz="1"/>
+            </w:tcBorders>
+            <w:shd w:fill="EEF4FB" w:val="clear"/>
+            <w:tcMar>
+              <w:top w:type="dxa" w:w="120"/>
+              <w:left w:type="dxa" w:w="200"/>
+              <w:bottom w:type="dxa" w:w="120"/>
+              <w:right w:type="dxa" w:w="200"/>
+            </w:tcMar>
+          </w:tcPr>
+          <w:p>
+            <w:pPr>
+              <w:spacing w:after="0" w:before="0"/>
+            </w:pPr>
+            <w:r>
+              <w:rPr>
+                <w:rFonts w:ascii="Arial" w:cs="Arial" w:eastAsia="Arial" w:hAnsi="Arial"/>
+                <w:b/>
+                <w:bCs/>
+                <w:color w:val="2C5F8A"/>
+                <w:sz w:val="22"/>
+                <w:szCs w:val="22"/>
+              </w:rPr>
+              <w:t xml:space="preserve">Which version of this guide applies to me? </w:t>
+            </w:r>
+            <w:r>
+              <w:rPr>
+                <w:rFonts w:ascii="Arial" w:cs="Arial" w:eastAsia="Arial" w:hAnsi="Arial"/>
+                <w:sz w:val="22"/>
+                <w:szCs w:val="22"/>
+              </w:rPr>
+              <w:t xml:space="preserve">If your account is a standard Sky East account, continue reading — Sections 1–5 describe your full workspace. If your account is set to “Sky East — Buy Plan only,” your screen is simpler than what Sections 2–4 show — skip ahead to Section 6 for your streamlined workflow.</w:t>
+            </w:r>
+            <w:r>
+              <w:rPr>
+                <w:rFonts w:ascii="Arial" w:cs="Arial" w:eastAsia="Arial" w:hAnsi="Arial"/>
+                <w:sz w:val="22"/>
+                <w:szCs w:val="22"/>
+              </w:rPr>
+              <w:br/>
+              <w:t xml:space="preserve"/>
+            </w:r>
+            <w:r>
+              <w:rPr>
+                <w:rFonts w:ascii="Arial" w:cs="Arial" w:eastAsia="Arial" w:hAnsi="Arial"/>
+                <w:b/>
+                <w:bCs/>
+                <w:color w:val="2C5F8A"/>
+                <w:sz w:val="22"/>
+                <w:szCs w:val="22"/>
+              </w:rPr>
+              <w:t xml:space="preserve">本指南哪个部分适用于我？ </w:t>
+            </w:r>
+            <w:r>
+              <w:rPr>
+                <w:rFonts w:ascii="Arial" w:cs="Arial" w:eastAsia="Arial" w:hAnsi="Arial"/>
+                <w:color w:val="555555"/>
+                <w:sz w:val="22"/>
+                <w:szCs w:val="22"/>
+              </w:rPr>
+              <w:t xml:space="preserve">如果您的账户是标准 Sky East 账户，请继续阅读——第 1 至 5 节介绍您的完整工作区。如果您的账户被设置为"Sky East — 仅买手计划"，您看到的界面会比第 2 至 4 节描述的更简单——请直接跳转至第 6 节，查看您的简化操作流程。</w:t>
+            </w:r>
+          </w:p>
+        </w:tc>
+      </w:tr>
+    </w:tbl>
+    <w:p>
+      <w:pPr>
+        <w:spacing w:after="60" w:before="60"/>
       </w:pPr>
     </w:p>
     <w:p>
@@ -1859,7 +1953,7 @@
           <w:sz w:val="24"/>
           <w:szCs w:val="24"/>
         </w:rPr>
-        <w:t xml:space="preserve">Step 4 — Process and Download</w:t>
+        <w:t xml:space="preserve">Step 4 — Save the Contract</w:t>
       </w:r>
     </w:p>
     <w:p>
@@ -1875,7 +1969,7 @@
           <w:sz w:val="22"/>
           <w:szCs w:val="22"/>
         </w:rPr>
-        <w:t xml:space="preserve">第四步 — 处理与下载</w:t>
+        <w:t xml:space="preserve">第四步 — 保存合同</w:t>
       </w:r>
     </w:p>
     <w:p>
@@ -1901,16 +1995,116 @@
           <w:sz w:val="22"/>
           <w:szCs w:val="22"/>
         </w:rPr>
-        <w:t xml:space="preserve">Process</w:t>
-      </w:r>
-      <w:r>
-        <w:rPr>
-          <w:rFonts w:ascii="Arial" w:cs="Arial" w:eastAsia="Arial" w:hAnsi="Arial"/>
-          <w:color w:val="1A1A1A"/>
-          <w:sz w:val="22"/>
-          <w:szCs w:val="22"/>
-        </w:rPr>
-        <w:t xml:space="preserve"> button (scroll down to find it). The system will process the contracts and generate:</w:t>
+        <w:t xml:space="preserve">Process Sky East Files</w:t>
+      </w:r>
+      <w:r>
+        <w:rPr>
+          <w:rFonts w:ascii="Arial" w:cs="Arial" w:eastAsia="Arial" w:hAnsi="Arial"/>
+          <w:color w:val="1A1A1A"/>
+          <w:sz w:val="22"/>
+          <w:szCs w:val="22"/>
+        </w:rPr>
+        <w:t xml:space="preserve"> button (scroll down to find it). This saves the contract(s) to the database — it does </w:t>
+      </w:r>
+      <w:r>
+        <w:rPr>
+          <w:rFonts w:ascii="Arial" w:cs="Arial" w:eastAsia="Arial" w:hAnsi="Arial"/>
+          <w:b/>
+          <w:bCs/>
+          <w:color w:val="1A1A1A"/>
+          <w:sz w:val="22"/>
+          <w:szCs w:val="22"/>
+        </w:rPr>
+        <w:t xml:space="preserve">not</w:t>
+      </w:r>
+      <w:r>
+        <w:rPr>
+          <w:rFonts w:ascii="Arial" w:cs="Arial" w:eastAsia="Arial" w:hAnsi="Arial"/>
+          <w:color w:val="1A1A1A"/>
+          <w:sz w:val="22"/>
+          <w:szCs w:val="22"/>
+        </w:rPr>
+        <w:t xml:space="preserve"> generate the Buy Plan or 核料 workbooks directly. </w:t>
+      </w:r>
+      <w:r>
+        <w:rPr>
+          <w:rFonts w:ascii="Arial" w:cs="Arial" w:eastAsia="Arial" w:hAnsi="Arial"/>
+          <w:b/>
+          <w:bCs/>
+          <w:color w:val="1A1A1A"/>
+          <w:sz w:val="22"/>
+          <w:szCs w:val="22"/>
+        </w:rPr>
+        <w:t xml:space="preserve">Next step:</w:t>
+      </w:r>
+      <w:r>
+        <w:rPr>
+          <w:rFonts w:ascii="Arial" w:cs="Arial" w:eastAsia="Arial" w:hAnsi="Arial"/>
+          <w:color w:val="1A1A1A"/>
+          <w:sz w:val="22"/>
+          <w:szCs w:val="22"/>
+        </w:rPr>
+        <w:t xml:space="preserve"> open the </w:t>
+      </w:r>
+      <w:r>
+        <w:rPr>
+          <w:rFonts w:ascii="Arial" w:cs="Arial" w:eastAsia="Arial" w:hAnsi="Arial"/>
+          <w:b/>
+          <w:bCs/>
+          <w:color w:val="1A1A1A"/>
+          <w:sz w:val="22"/>
+          <w:szCs w:val="22"/>
+        </w:rPr>
+        <w:t xml:space="preserve">📦 Generate / Export</w:t>
+      </w:r>
+      <w:r>
+        <w:rPr>
+          <w:rFonts w:ascii="Arial" w:cs="Arial" w:eastAsia="Arial" w:hAnsi="Arial"/>
+          <w:color w:val="1A1A1A"/>
+          <w:sz w:val="22"/>
+          <w:szCs w:val="22"/>
+        </w:rPr>
+        <w:t xml:space="preserve"> sub-tab to generate and download the </w:t>
+      </w:r>
+      <w:r>
+        <w:rPr>
+          <w:rFonts w:ascii="Arial" w:cs="Arial" w:eastAsia="Arial" w:hAnsi="Arial"/>
+          <w:b/>
+          <w:bCs/>
+          <w:color w:val="1A1A1A"/>
+          <w:sz w:val="22"/>
+          <w:szCs w:val="22"/>
+        </w:rPr>
+        <w:t xml:space="preserve">Buy Plan (.xlsx)</w:t>
+      </w:r>
+      <w:r>
+        <w:rPr>
+          <w:rFonts w:ascii="Arial" w:cs="Arial" w:eastAsia="Arial" w:hAnsi="Arial"/>
+          <w:color w:val="1A1A1A"/>
+          <w:sz w:val="22"/>
+          <w:szCs w:val="22"/>
+        </w:rPr>
+        <w:t xml:space="preserve"> and </w:t>
+      </w:r>
+      <w:r>
+        <w:rPr>
+          <w:rFonts w:ascii="Arial" w:cs="Arial" w:eastAsia="Arial" w:hAnsi="Arial"/>
+          <w:b/>
+          <w:bCs/>
+          <w:color w:val="1A1A1A"/>
+          <w:sz w:val="22"/>
+          <w:szCs w:val="22"/>
+        </w:rPr>
+        <w:t xml:space="preserve">核料 Workbooks (.zip)</w:t>
+      </w:r>
+      <w:r>
+        <w:rPr>
+          <w:rFonts w:ascii="Arial" w:cs="Arial" w:eastAsia="Arial" w:hAnsi="Arial"/>
+          <w:color w:val="1A1A1A"/>
+          <w:sz w:val="22"/>
+          <w:szCs w:val="22"/>
+        </w:rPr>
+        <w:t xml:space="preserve"> for your saved contracts (see Section 6 for the streamlined Buy Plan Only version of this step).</w:t>
       </w:r>
       <w:r>
         <w:rPr>
@@ -1939,180 +2133,116 @@
           <w:sz w:val="22"/>
           <w:szCs w:val="22"/>
         </w:rPr>
-        <w:t xml:space="preserve">处理</w:t>
-      </w:r>
-      <w:r>
-        <w:rPr>
-          <w:rFonts w:ascii="Arial" w:cs="Arial" w:eastAsia="Arial" w:hAnsi="Arial"/>
-          <w:color w:val="555555"/>
-          <w:sz w:val="22"/>
-          <w:szCs w:val="22"/>
-        </w:rPr>
-        <w:t xml:space="preserve">"按钮（向下滚动可找到）。系统将处理合同并生成以下文件：</w:t>
-      </w:r>
-    </w:p>
-    <w:p>
-      <w:pPr>
-        <w:pStyle w:val="ListParagraph"/>
-        <w:numPr>
-          <w:ilvl w:val="0"/>
-          <w:numId w:val="3"/>
-        </w:numPr>
-        <w:spacing w:after="60" w:before="60"/>
-      </w:pPr>
-      <w:r>
-        <w:rPr>
-          <w:rFonts w:ascii="Arial" w:cs="Arial" w:eastAsia="Arial" w:hAnsi="Arial"/>
-          <w:b/>
-          <w:bCs/>
-          <w:color w:val="1A1A1A"/>
-          <w:sz w:val="22"/>
-          <w:szCs w:val="22"/>
-        </w:rPr>
-        <w:t xml:space="preserve">Buy Plan workbook</w:t>
-      </w:r>
-      <w:r>
-        <w:rPr>
-          <w:rFonts w:ascii="Arial" w:cs="Arial" w:eastAsia="Arial" w:hAnsi="Arial"/>
-          <w:b w:val="false"/>
-          <w:bCs w:val="false"/>
-          <w:color w:val="1A1A1A"/>
-          <w:sz w:val="22"/>
-          <w:szCs w:val="22"/>
-        </w:rPr>
-        <w:t xml:space="preserve"> — the main output Excel file</w:t>
-      </w:r>
-      <w:r>
-        <w:rPr>
-          <w:rFonts w:ascii="Arial" w:cs="Arial" w:eastAsia="Arial" w:hAnsi="Arial"/>
-          <w:sz w:val="22"/>
-          <w:szCs w:val="22"/>
-        </w:rPr>
-        <w:br/>
-        <w:t xml:space="preserve"/>
-      </w:r>
-      <w:r>
-        <w:rPr>
-          <w:rFonts w:ascii="Arial" w:cs="Arial" w:eastAsia="Arial" w:hAnsi="Arial"/>
-          <w:b/>
-          <w:bCs/>
-          <w:color w:val="555555"/>
-          <w:sz w:val="22"/>
-          <w:szCs w:val="22"/>
-        </w:rPr>
-        <w:t xml:space="preserve">买手计划工作簿</w:t>
-      </w:r>
-      <w:r>
-        <w:rPr>
-          <w:rFonts w:ascii="Arial" w:cs="Arial" w:eastAsia="Arial" w:hAnsi="Arial"/>
-          <w:b w:val="false"/>
-          <w:bCs w:val="false"/>
-          <w:color w:val="555555"/>
-          <w:sz w:val="22"/>
-          <w:szCs w:val="22"/>
-        </w:rPr>
-        <w:t xml:space="preserve"> — 主要输出 Excel 文件</w:t>
-      </w:r>
-    </w:p>
-    <w:p>
-      <w:pPr>
-        <w:pStyle w:val="ListParagraph"/>
-        <w:numPr>
-          <w:ilvl w:val="0"/>
-          <w:numId w:val="3"/>
-        </w:numPr>
-        <w:spacing w:after="60" w:before="60"/>
-      </w:pPr>
-      <w:r>
-        <w:rPr>
-          <w:rFonts w:ascii="Arial" w:cs="Arial" w:eastAsia="Arial" w:hAnsi="Arial"/>
-          <w:b/>
-          <w:bCs/>
-          <w:color w:val="1A1A1A"/>
-          <w:sz w:val="22"/>
-          <w:szCs w:val="22"/>
-        </w:rPr>
-        <w:t xml:space="preserve">核料 (Nukuryou) workbook</w:t>
-      </w:r>
-      <w:r>
-        <w:rPr>
-          <w:rFonts w:ascii="Arial" w:cs="Arial" w:eastAsia="Arial" w:hAnsi="Arial"/>
-          <w:b w:val="false"/>
-          <w:bCs w:val="false"/>
-          <w:color w:val="1A1A1A"/>
-          <w:sz w:val="22"/>
-          <w:szCs w:val="22"/>
-        </w:rPr>
-        <w:t xml:space="preserve"> — fabric requisition summary</w:t>
-      </w:r>
-      <w:r>
-        <w:rPr>
-          <w:rFonts w:ascii="Arial" w:cs="Arial" w:eastAsia="Arial" w:hAnsi="Arial"/>
-          <w:sz w:val="22"/>
-          <w:szCs w:val="22"/>
-        </w:rPr>
-        <w:br/>
-        <w:t xml:space="preserve"/>
-      </w:r>
-      <w:r>
-        <w:rPr>
-          <w:rFonts w:ascii="Arial" w:cs="Arial" w:eastAsia="Arial" w:hAnsi="Arial"/>
-          <w:b/>
-          <w:bCs/>
-          <w:color w:val="555555"/>
-          <w:sz w:val="22"/>
-          <w:szCs w:val="22"/>
-        </w:rPr>
-        <w:t xml:space="preserve">核料工作簿</w:t>
-      </w:r>
-      <w:r>
-        <w:rPr>
-          <w:rFonts w:ascii="Arial" w:cs="Arial" w:eastAsia="Arial" w:hAnsi="Arial"/>
-          <w:b w:val="false"/>
-          <w:bCs w:val="false"/>
-          <w:color w:val="555555"/>
-          <w:sz w:val="22"/>
-          <w:szCs w:val="22"/>
-        </w:rPr>
-        <w:t xml:space="preserve"> — 面料申请摘要</w:t>
-      </w:r>
-    </w:p>
-    <w:p>
-      <w:pPr>
-        <w:spacing w:after="60" w:before="60"/>
-      </w:pPr>
-    </w:p>
-    <w:p>
-      <w:pPr>
-        <w:spacing w:after="80" w:before="80"/>
-        <w:jc w:val="left"/>
-      </w:pPr>
-      <w:r>
-        <w:rPr>
-          <w:rFonts w:ascii="Arial" w:cs="Arial" w:eastAsia="Arial" w:hAnsi="Arial"/>
-          <w:color w:val="1A1A1A"/>
-          <w:sz w:val="22"/>
-          <w:szCs w:val="22"/>
-        </w:rPr>
-        <w:t xml:space="preserve">Download buttons will appear after processing is complete. Click each button to save the files to your computer.</w:t>
-      </w:r>
-      <w:r>
-        <w:rPr>
-          <w:rFonts w:ascii="Arial" w:cs="Arial" w:eastAsia="Arial" w:hAnsi="Arial"/>
-          <w:sz w:val="22"/>
-          <w:szCs w:val="22"/>
-        </w:rPr>
-        <w:br/>
-        <w:t xml:space="preserve"/>
-      </w:r>
-      <w:r>
-        <w:rPr>
-          <w:rFonts w:ascii="Arial" w:cs="Arial" w:eastAsia="Arial" w:hAnsi="Arial"/>
-          <w:color w:val="555555"/>
-          <w:sz w:val="22"/>
-          <w:szCs w:val="22"/>
-        </w:rPr>
-        <w:t xml:space="preserve">处理完成后将显示下载按钮。点击各按钮将文件保存至您的电脑。</w:t>
+        <w:t xml:space="preserve">处理天东文件</w:t>
+      </w:r>
+      <w:r>
+        <w:rPr>
+          <w:rFonts w:ascii="Arial" w:cs="Arial" w:eastAsia="Arial" w:hAnsi="Arial"/>
+          <w:color w:val="555555"/>
+          <w:sz w:val="22"/>
+          <w:szCs w:val="22"/>
+        </w:rPr>
+        <w:t xml:space="preserve">"按钮（向下滚动可找到）。此操作会将合同保存至数据库——并</w:t>
+      </w:r>
+      <w:r>
+        <w:rPr>
+          <w:rFonts w:ascii="Arial" w:cs="Arial" w:eastAsia="Arial" w:hAnsi="Arial"/>
+          <w:b/>
+          <w:bCs/>
+          <w:color w:val="555555"/>
+          <w:sz w:val="22"/>
+          <w:szCs w:val="22"/>
+        </w:rPr>
+        <w:t xml:space="preserve">不会</w:t>
+      </w:r>
+      <w:r>
+        <w:rPr>
+          <w:rFonts w:ascii="Arial" w:cs="Arial" w:eastAsia="Arial" w:hAnsi="Arial"/>
+          <w:color w:val="555555"/>
+          <w:sz w:val="22"/>
+          <w:szCs w:val="22"/>
+        </w:rPr>
+        <w:t xml:space="preserve">直接生成买手计划或核料工作簿。</w:t>
+      </w:r>
+      <w:r>
+        <w:rPr>
+          <w:rFonts w:ascii="Arial" w:cs="Arial" w:eastAsia="Arial" w:hAnsi="Arial"/>
+          <w:b/>
+          <w:bCs/>
+          <w:color w:val="555555"/>
+          <w:sz w:val="22"/>
+          <w:szCs w:val="22"/>
+        </w:rPr>
+        <w:t xml:space="preserve">下一步：</w:t>
+      </w:r>
+      <w:r>
+        <w:rPr>
+          <w:rFonts w:ascii="Arial" w:cs="Arial" w:eastAsia="Arial" w:hAnsi="Arial"/>
+          <w:color w:val="555555"/>
+          <w:sz w:val="22"/>
+          <w:szCs w:val="22"/>
+        </w:rPr>
+        <w:t xml:space="preserve">打开"</w:t>
+      </w:r>
+      <w:r>
+        <w:rPr>
+          <w:rFonts w:ascii="Arial" w:cs="Arial" w:eastAsia="Arial" w:hAnsi="Arial"/>
+          <w:b/>
+          <w:bCs/>
+          <w:color w:val="555555"/>
+          <w:sz w:val="22"/>
+          <w:szCs w:val="22"/>
+        </w:rPr>
+        <w:t xml:space="preserve">📦 生成/导出</w:t>
+      </w:r>
+      <w:r>
+        <w:rPr>
+          <w:rFonts w:ascii="Arial" w:cs="Arial" w:eastAsia="Arial" w:hAnsi="Arial"/>
+          <w:color w:val="555555"/>
+          <w:sz w:val="22"/>
+          <w:szCs w:val="22"/>
+        </w:rPr>
+        <w:t xml:space="preserve">"子标签页，为已保存的合同生成并下载</w:t>
+      </w:r>
+      <w:r>
+        <w:rPr>
+          <w:rFonts w:ascii="Arial" w:cs="Arial" w:eastAsia="Arial" w:hAnsi="Arial"/>
+          <w:b/>
+          <w:bCs/>
+          <w:color w:val="555555"/>
+          <w:sz w:val="22"/>
+          <w:szCs w:val="22"/>
+        </w:rPr>
+        <w:t xml:space="preserve">买手计划（.xlsx）</w:t>
+      </w:r>
+      <w:r>
+        <w:rPr>
+          <w:rFonts w:ascii="Arial" w:cs="Arial" w:eastAsia="Arial" w:hAnsi="Arial"/>
+          <w:color w:val="555555"/>
+          <w:sz w:val="22"/>
+          <w:szCs w:val="22"/>
+        </w:rPr>
+        <w:t xml:space="preserve">和</w:t>
+      </w:r>
+      <w:r>
+        <w:rPr>
+          <w:rFonts w:ascii="Arial" w:cs="Arial" w:eastAsia="Arial" w:hAnsi="Arial"/>
+          <w:b/>
+          <w:bCs/>
+          <w:color w:val="555555"/>
+          <w:sz w:val="22"/>
+          <w:szCs w:val="22"/>
+        </w:rPr>
+        <w:t xml:space="preserve">核料工作簿（.zip）</w:t>
+      </w:r>
+      <w:r>
+        <w:rPr>
+          <w:rFonts w:ascii="Arial" w:cs="Arial" w:eastAsia="Arial" w:hAnsi="Arial"/>
+          <w:color w:val="555555"/>
+          <w:sz w:val="22"/>
+          <w:szCs w:val="22"/>
+        </w:rPr>
+        <w:t xml:space="preserve">（"仅买手计划"账户的简化步骤见第 6 节）。</w:t>
       </w:r>
     </w:p>
     <w:p>
@@ -4093,6 +4223,827 @@
         <w:t xml:space="preserve">"按钮，退出应用程序。</w:t>
       </w:r>
     </w:p>
+    <w:p>
+      <w:pPr>
+        <w:spacing w:after="60" w:before="60"/>
+      </w:pPr>
+    </w:p>
+    <w:p>
+      <w:pPr>
+        <w:pStyle w:val="Heading1"/>
+        <w:spacing w:after="0" w:before="400"/>
+      </w:pPr>
+      <w:r>
+        <w:rPr>
+          <w:rFonts w:ascii="Arial" w:cs="Arial" w:eastAsia="Arial" w:hAnsi="Arial"/>
+          <w:b/>
+          <w:bCs/>
+          <w:color w:val="2C5F8A"/>
+          <w:sz w:val="32"/>
+          <w:szCs w:val="32"/>
+        </w:rPr>
+        <w:t xml:space="preserve">6.  Sky East — Buy Plan Only Accounts</w:t>
+      </w:r>
+    </w:p>
+    <w:p>
+      <w:pPr>
+        <w:spacing w:after="120" w:before="0"/>
+      </w:pPr>
+      <w:r>
+        <w:rPr>
+          <w:rFonts w:ascii="Arial" w:cs="Arial" w:eastAsia="Arial" w:hAnsi="Arial"/>
+          <w:b/>
+          <w:bCs/>
+          <w:color w:val="2C5F8A"/>
+          <w:sz w:val="28"/>
+          <w:szCs w:val="28"/>
+        </w:rPr>
+        <w:t xml:space="preserve">6.  Sky East — 仅买手计划账户</w:t>
+      </w:r>
+    </w:p>
+    <w:p>
+      <w:pPr>
+        <w:spacing w:after="80" w:before="80"/>
+        <w:jc w:val="left"/>
+      </w:pPr>
+      <w:r>
+        <w:rPr>
+          <w:rFonts w:ascii="Arial" w:cs="Arial" w:eastAsia="Arial" w:hAnsi="Arial"/>
+          <w:color w:val="1A1A1A"/>
+          <w:sz w:val="22"/>
+          <w:szCs w:val="22"/>
+        </w:rPr>
+        <w:t xml:space="preserve">Some accounts are set up as “Sky East — Buy Plan only” — a simplified version of the Sky East workspace for users who only need to upload contracts and generate the buy plan. If this is your account type, your screen looks different from what Sections 2–4 describe:</w:t>
+      </w:r>
+      <w:r>
+        <w:rPr>
+          <w:rFonts w:ascii="Arial" w:cs="Arial" w:eastAsia="Arial" w:hAnsi="Arial"/>
+          <w:sz w:val="22"/>
+          <w:szCs w:val="22"/>
+        </w:rPr>
+        <w:br/>
+        <w:t xml:space="preserve"/>
+      </w:r>
+      <w:r>
+        <w:rPr>
+          <w:rFonts w:ascii="Arial" w:cs="Arial" w:eastAsia="Arial" w:hAnsi="Arial"/>
+          <w:color w:val="555555"/>
+          <w:sz w:val="22"/>
+          <w:szCs w:val="22"/>
+        </w:rPr>
+        <w:t xml:space="preserve">部分账户被设置为"Sky East — 仅买手计划"——这是 Sky East 工作区的简化版本，适用于只需要上传合同并生成买手计划的用户。如果这是您的账户类型，您看到的界面会与第 2 至 4 节描述的不同：</w:t>
+      </w:r>
+    </w:p>
+    <w:p>
+      <w:pPr>
+        <w:pStyle w:val="ListParagraph"/>
+        <w:numPr>
+          <w:ilvl w:val="0"/>
+          <w:numId w:val="3"/>
+        </w:numPr>
+        <w:spacing w:after="60" w:before="60"/>
+      </w:pPr>
+      <w:r>
+        <w:rPr>
+          <w:rFonts w:ascii="Arial" w:cs="Arial" w:eastAsia="Arial" w:hAnsi="Arial"/>
+          <w:b/>
+          <w:bCs/>
+          <w:color w:val="1A1A1A"/>
+          <w:sz w:val="22"/>
+          <w:szCs w:val="22"/>
+        </w:rPr>
+        <w:t xml:space="preserve">One tab only: </w:t>
+      </w:r>
+      <w:r>
+        <w:rPr>
+          <w:rFonts w:ascii="Arial" w:cs="Arial" w:eastAsia="Arial" w:hAnsi="Arial"/>
+          <w:b w:val="false"/>
+          <w:bCs w:val="false"/>
+          <w:color w:val="1A1A1A"/>
+          <w:sz w:val="22"/>
+          <w:szCs w:val="22"/>
+        </w:rPr>
+        <w:t xml:space="preserve">After signing in, the top navigation bar shows a single </w:t>
+      </w:r>
+      <w:r>
+        <w:rPr>
+          <w:rFonts w:ascii="Arial" w:cs="Arial" w:eastAsia="Arial" w:hAnsi="Arial"/>
+          <w:b/>
+          <w:bCs/>
+          <w:color w:val="1A1A1A"/>
+          <w:sz w:val="22"/>
+          <w:szCs w:val="22"/>
+        </w:rPr>
+        <w:t xml:space="preserve">Sky East</w:t>
+      </w:r>
+      <w:r>
+        <w:rPr>
+          <w:rFonts w:ascii="Arial" w:cs="Arial" w:eastAsia="Arial" w:hAnsi="Arial"/>
+          <w:b w:val="false"/>
+          <w:bCs w:val="false"/>
+          <w:color w:val="1A1A1A"/>
+          <w:sz w:val="22"/>
+          <w:szCs w:val="22"/>
+        </w:rPr>
+        <w:t xml:space="preserve"> tab. The Summary and Colors tabs described in Sections 3 and 4 are not available to this account type.</w:t>
+      </w:r>
+      <w:r>
+        <w:rPr>
+          <w:rFonts w:ascii="Arial" w:cs="Arial" w:eastAsia="Arial" w:hAnsi="Arial"/>
+          <w:sz w:val="22"/>
+          <w:szCs w:val="22"/>
+        </w:rPr>
+        <w:br/>
+        <w:t xml:space="preserve"/>
+      </w:r>
+      <w:r>
+        <w:rPr>
+          <w:rFonts w:ascii="Arial" w:cs="Arial" w:eastAsia="Arial" w:hAnsi="Arial"/>
+          <w:b/>
+          <w:bCs/>
+          <w:color w:val="555555"/>
+          <w:sz w:val="22"/>
+          <w:szCs w:val="22"/>
+        </w:rPr>
+        <w:t xml:space="preserve">只有一个标签页：</w:t>
+      </w:r>
+      <w:r>
+        <w:rPr>
+          <w:rFonts w:ascii="Arial" w:cs="Arial" w:eastAsia="Arial" w:hAnsi="Arial"/>
+          <w:b w:val="false"/>
+          <w:bCs w:val="false"/>
+          <w:color w:val="555555"/>
+          <w:sz w:val="22"/>
+          <w:szCs w:val="22"/>
+        </w:rPr>
+        <w:t xml:space="preserve">登录后，顶部导航栏只会显示一个 </w:t>
+      </w:r>
+      <w:r>
+        <w:rPr>
+          <w:rFonts w:ascii="Arial" w:cs="Arial" w:eastAsia="Arial" w:hAnsi="Arial"/>
+          <w:b/>
+          <w:bCs/>
+          <w:color w:val="555555"/>
+          <w:sz w:val="22"/>
+          <w:szCs w:val="22"/>
+        </w:rPr>
+        <w:t xml:space="preserve">Sky East</w:t>
+      </w:r>
+      <w:r>
+        <w:rPr>
+          <w:rFonts w:ascii="Arial" w:cs="Arial" w:eastAsia="Arial" w:hAnsi="Arial"/>
+          <w:b w:val="false"/>
+          <w:bCs w:val="false"/>
+          <w:color w:val="555555"/>
+          <w:sz w:val="22"/>
+          <w:szCs w:val="22"/>
+        </w:rPr>
+        <w:t xml:space="preserve"> 标签页。第 3 节和第 4 节介绍的摘要和颜色标签页不适用于此账户类型。</w:t>
+      </w:r>
+    </w:p>
+    <w:p>
+      <w:pPr>
+        <w:pStyle w:val="ListParagraph"/>
+        <w:numPr>
+          <w:ilvl w:val="0"/>
+          <w:numId w:val="3"/>
+        </w:numPr>
+        <w:spacing w:after="60" w:before="60"/>
+      </w:pPr>
+      <w:r>
+        <w:rPr>
+          <w:rFonts w:ascii="Arial" w:cs="Arial" w:eastAsia="Arial" w:hAnsi="Arial"/>
+          <w:b/>
+          <w:bCs/>
+          <w:color w:val="1A1A1A"/>
+          <w:sz w:val="22"/>
+          <w:szCs w:val="22"/>
+        </w:rPr>
+        <w:t xml:space="preserve">Two sub-tabs only: </w:t>
+      </w:r>
+      <w:r>
+        <w:rPr>
+          <w:rFonts w:ascii="Arial" w:cs="Arial" w:eastAsia="Arial" w:hAnsi="Arial"/>
+          <w:b w:val="false"/>
+          <w:bCs w:val="false"/>
+          <w:color w:val="1A1A1A"/>
+          <w:sz w:val="22"/>
+          <w:szCs w:val="22"/>
+        </w:rPr>
+        <w:t xml:space="preserve">Inside Sky East you will see </w:t>
+      </w:r>
+      <w:r>
+        <w:rPr>
+          <w:rFonts w:ascii="Arial" w:cs="Arial" w:eastAsia="Arial" w:hAnsi="Arial"/>
+          <w:b/>
+          <w:bCs/>
+          <w:color w:val="1A1A1A"/>
+          <w:sz w:val="22"/>
+          <w:szCs w:val="22"/>
+        </w:rPr>
+        <w:t xml:space="preserve">New Contracts</w:t>
+      </w:r>
+      <w:r>
+        <w:rPr>
+          <w:rFonts w:ascii="Arial" w:cs="Arial" w:eastAsia="Arial" w:hAnsi="Arial"/>
+          <w:b w:val="false"/>
+          <w:bCs w:val="false"/>
+          <w:color w:val="1A1A1A"/>
+          <w:sz w:val="22"/>
+          <w:szCs w:val="22"/>
+        </w:rPr>
+        <w:t xml:space="preserve"> and </w:t>
+      </w:r>
+      <w:r>
+        <w:rPr>
+          <w:rFonts w:ascii="Arial" w:cs="Arial" w:eastAsia="Arial" w:hAnsi="Arial"/>
+          <w:b/>
+          <w:bCs/>
+          <w:color w:val="1A1A1A"/>
+          <w:sz w:val="22"/>
+          <w:szCs w:val="22"/>
+        </w:rPr>
+        <w:t xml:space="preserve">📦 Generate / Export</w:t>
+      </w:r>
+      <w:r>
+        <w:rPr>
+          <w:rFonts w:ascii="Arial" w:cs="Arial" w:eastAsia="Arial" w:hAnsi="Arial"/>
+          <w:b w:val="false"/>
+          <w:bCs w:val="false"/>
+          <w:color w:val="1A1A1A"/>
+          <w:sz w:val="22"/>
+          <w:szCs w:val="22"/>
+        </w:rPr>
+        <w:t xml:space="preserve">. Contract History and Missing Fields (Sections 2.2–2.3) are not available.</w:t>
+      </w:r>
+      <w:r>
+        <w:rPr>
+          <w:rFonts w:ascii="Arial" w:cs="Arial" w:eastAsia="Arial" w:hAnsi="Arial"/>
+          <w:sz w:val="22"/>
+          <w:szCs w:val="22"/>
+        </w:rPr>
+        <w:br/>
+        <w:t xml:space="preserve"/>
+      </w:r>
+      <w:r>
+        <w:rPr>
+          <w:rFonts w:ascii="Arial" w:cs="Arial" w:eastAsia="Arial" w:hAnsi="Arial"/>
+          <w:b/>
+          <w:bCs/>
+          <w:color w:val="555555"/>
+          <w:sz w:val="22"/>
+          <w:szCs w:val="22"/>
+        </w:rPr>
+        <w:t xml:space="preserve">只有两个子标签页：</w:t>
+      </w:r>
+      <w:r>
+        <w:rPr>
+          <w:rFonts w:ascii="Arial" w:cs="Arial" w:eastAsia="Arial" w:hAnsi="Arial"/>
+          <w:b w:val="false"/>
+          <w:bCs w:val="false"/>
+          <w:color w:val="555555"/>
+          <w:sz w:val="22"/>
+          <w:szCs w:val="22"/>
+        </w:rPr>
+        <w:t xml:space="preserve">在 Sky East 标签页中，您将看到 </w:t>
+      </w:r>
+      <w:r>
+        <w:rPr>
+          <w:rFonts w:ascii="Arial" w:cs="Arial" w:eastAsia="Arial" w:hAnsi="Arial"/>
+          <w:b/>
+          <w:bCs/>
+          <w:color w:val="555555"/>
+          <w:sz w:val="22"/>
+          <w:szCs w:val="22"/>
+        </w:rPr>
+        <w:t xml:space="preserve">新建合同</w:t>
+      </w:r>
+      <w:r>
+        <w:rPr>
+          <w:rFonts w:ascii="Arial" w:cs="Arial" w:eastAsia="Arial" w:hAnsi="Arial"/>
+          <w:b w:val="false"/>
+          <w:bCs w:val="false"/>
+          <w:color w:val="555555"/>
+          <w:sz w:val="22"/>
+          <w:szCs w:val="22"/>
+        </w:rPr>
+        <w:t xml:space="preserve">和 </w:t>
+      </w:r>
+      <w:r>
+        <w:rPr>
+          <w:rFonts w:ascii="Arial" w:cs="Arial" w:eastAsia="Arial" w:hAnsi="Arial"/>
+          <w:b/>
+          <w:bCs/>
+          <w:color w:val="555555"/>
+          <w:sz w:val="22"/>
+          <w:szCs w:val="22"/>
+        </w:rPr>
+        <w:t xml:space="preserve">📦 生成/导出</w:t>
+      </w:r>
+      <w:r>
+        <w:rPr>
+          <w:rFonts w:ascii="Arial" w:cs="Arial" w:eastAsia="Arial" w:hAnsi="Arial"/>
+          <w:b w:val="false"/>
+          <w:bCs w:val="false"/>
+          <w:color w:val="555555"/>
+          <w:sz w:val="22"/>
+          <w:szCs w:val="22"/>
+        </w:rPr>
+        <w:t xml:space="preserve">。合同历史和缺失字段（第 2.2–2.3 节）不适用于此账户类型。</w:t>
+      </w:r>
+    </w:p>
+    <w:p>
+      <w:pPr>
+        <w:pStyle w:val="ListParagraph"/>
+        <w:numPr>
+          <w:ilvl w:val="0"/>
+          <w:numId w:val="3"/>
+        </w:numPr>
+        <w:spacing w:after="60" w:before="60"/>
+      </w:pPr>
+      <w:r>
+        <w:rPr>
+          <w:rFonts w:ascii="Arial" w:cs="Arial" w:eastAsia="Arial" w:hAnsi="Arial"/>
+          <w:b/>
+          <w:bCs/>
+          <w:color w:val="1A1A1A"/>
+          <w:sz w:val="22"/>
+          <w:szCs w:val="22"/>
+        </w:rPr>
+        <w:t xml:space="preserve">Uploading is unchanged: </w:t>
+      </w:r>
+      <w:r>
+        <w:rPr>
+          <w:rFonts w:ascii="Arial" w:cs="Arial" w:eastAsia="Arial" w:hAnsi="Arial"/>
+          <w:b w:val="false"/>
+          <w:bCs w:val="false"/>
+          <w:color w:val="1A1A1A"/>
+          <w:sz w:val="22"/>
+          <w:szCs w:val="22"/>
+        </w:rPr>
+        <w:t xml:space="preserve">The New Contracts sub-tab works exactly as described in Section 2.1 — upload your order files, optionally add reference files, and choose a Chinese color mapping source.</w:t>
+      </w:r>
+      <w:r>
+        <w:rPr>
+          <w:rFonts w:ascii="Arial" w:cs="Arial" w:eastAsia="Arial" w:hAnsi="Arial"/>
+          <w:sz w:val="22"/>
+          <w:szCs w:val="22"/>
+        </w:rPr>
+        <w:br/>
+        <w:t xml:space="preserve"/>
+      </w:r>
+      <w:r>
+        <w:rPr>
+          <w:rFonts w:ascii="Arial" w:cs="Arial" w:eastAsia="Arial" w:hAnsi="Arial"/>
+          <w:b/>
+          <w:bCs/>
+          <w:color w:val="555555"/>
+          <w:sz w:val="22"/>
+          <w:szCs w:val="22"/>
+        </w:rPr>
+        <w:t xml:space="preserve">上传方式不变：</w:t>
+      </w:r>
+      <w:r>
+        <w:rPr>
+          <w:rFonts w:ascii="Arial" w:cs="Arial" w:eastAsia="Arial" w:hAnsi="Arial"/>
+          <w:b w:val="false"/>
+          <w:bCs w:val="false"/>
+          <w:color w:val="555555"/>
+          <w:sz w:val="22"/>
+          <w:szCs w:val="22"/>
+        </w:rPr>
+        <w:t xml:space="preserve">新建合同子标签页的操作方式与第 2.1 节描述的完全一致——上传订单文件，可选择添加参考文件，并选择中文颜色映射来源。</w:t>
+      </w:r>
+    </w:p>
+    <w:p>
+      <w:pPr>
+        <w:pStyle w:val="ListParagraph"/>
+        <w:numPr>
+          <w:ilvl w:val="0"/>
+          <w:numId w:val="3"/>
+        </w:numPr>
+        <w:spacing w:after="60" w:before="60"/>
+      </w:pPr>
+      <w:r>
+        <w:rPr>
+          <w:rFonts w:ascii="Arial" w:cs="Arial" w:eastAsia="Arial" w:hAnsi="Arial"/>
+          <w:b/>
+          <w:bCs/>
+          <w:color w:val="1A1A1A"/>
+          <w:sz w:val="22"/>
+          <w:szCs w:val="22"/>
+        </w:rPr>
+        <w:t xml:space="preserve">Generate / Export always produces the buy plan: </w:t>
+      </w:r>
+      <w:r>
+        <w:rPr>
+          <w:rFonts w:ascii="Arial" w:cs="Arial" w:eastAsia="Arial" w:hAnsi="Arial"/>
+          <w:b w:val="false"/>
+          <w:bCs w:val="false"/>
+          <w:color w:val="1A1A1A"/>
+          <w:sz w:val="22"/>
+          <w:szCs w:val="22"/>
+        </w:rPr>
+        <w:t xml:space="preserve">There is no “What do you want to generate?” choice — it goes straight to buy plan generation. Select one or more PC numbers (or click </w:t>
+      </w:r>
+      <w:r>
+        <w:rPr>
+          <w:rFonts w:ascii="Arial" w:cs="Arial" w:eastAsia="Arial" w:hAnsi="Arial"/>
+          <w:b/>
+          <w:bCs/>
+          <w:color w:val="1A1A1A"/>
+          <w:sz w:val="22"/>
+          <w:szCs w:val="22"/>
+        </w:rPr>
+        <w:t xml:space="preserve">Select all</w:t>
+      </w:r>
+      <w:r>
+        <w:rPr>
+          <w:rFonts w:ascii="Arial" w:cs="Arial" w:eastAsia="Arial" w:hAnsi="Arial"/>
+          <w:b w:val="false"/>
+          <w:bCs w:val="false"/>
+          <w:color w:val="1A1A1A"/>
+          <w:sz w:val="22"/>
+          <w:szCs w:val="22"/>
+        </w:rPr>
+        <w:t xml:space="preserve">), confirm the Chinese color mapping source, then click </w:t>
+      </w:r>
+      <w:r>
+        <w:rPr>
+          <w:rFonts w:ascii="Arial" w:cs="Arial" w:eastAsia="Arial" w:hAnsi="Arial"/>
+          <w:b/>
+          <w:bCs/>
+          <w:color w:val="1A1A1A"/>
+          <w:sz w:val="22"/>
+          <w:szCs w:val="22"/>
+        </w:rPr>
+        <w:t xml:space="preserve">Generate Buy Plan + 核料</w:t>
+      </w:r>
+      <w:r>
+        <w:rPr>
+          <w:rFonts w:ascii="Arial" w:cs="Arial" w:eastAsia="Arial" w:hAnsi="Arial"/>
+          <w:b w:val="false"/>
+          <w:bCs w:val="false"/>
+          <w:color w:val="1A1A1A"/>
+          <w:sz w:val="22"/>
+          <w:szCs w:val="22"/>
+        </w:rPr>
+        <w:t xml:space="preserve">.</w:t>
+      </w:r>
+      <w:r>
+        <w:rPr>
+          <w:rFonts w:ascii="Arial" w:cs="Arial" w:eastAsia="Arial" w:hAnsi="Arial"/>
+          <w:sz w:val="22"/>
+          <w:szCs w:val="22"/>
+        </w:rPr>
+        <w:br/>
+        <w:t xml:space="preserve"/>
+      </w:r>
+      <w:r>
+        <w:rPr>
+          <w:rFonts w:ascii="Arial" w:cs="Arial" w:eastAsia="Arial" w:hAnsi="Arial"/>
+          <w:b/>
+          <w:bCs/>
+          <w:color w:val="555555"/>
+          <w:sz w:val="22"/>
+          <w:szCs w:val="22"/>
+        </w:rPr>
+        <w:t xml:space="preserve">生成/导出始终直接生成买手计划：</w:t>
+      </w:r>
+      <w:r>
+        <w:rPr>
+          <w:rFonts w:ascii="Arial" w:cs="Arial" w:eastAsia="Arial" w:hAnsi="Arial"/>
+          <w:b w:val="false"/>
+          <w:bCs w:val="false"/>
+          <w:color w:val="555555"/>
+          <w:sz w:val="22"/>
+          <w:szCs w:val="22"/>
+        </w:rPr>
+        <w:t xml:space="preserve">没有"您想生成什么？"的选择步骤——直接进入买手计划生成流程。选择一个或多个 PC 编号（或点击</w:t>
+      </w:r>
+      <w:r>
+        <w:rPr>
+          <w:rFonts w:ascii="Arial" w:cs="Arial" w:eastAsia="Arial" w:hAnsi="Arial"/>
+          <w:b/>
+          <w:bCs/>
+          <w:color w:val="555555"/>
+          <w:sz w:val="22"/>
+          <w:szCs w:val="22"/>
+        </w:rPr>
+        <w:t xml:space="preserve">全选</w:t>
+      </w:r>
+      <w:r>
+        <w:rPr>
+          <w:rFonts w:ascii="Arial" w:cs="Arial" w:eastAsia="Arial" w:hAnsi="Arial"/>
+          <w:b w:val="false"/>
+          <w:bCs w:val="false"/>
+          <w:color w:val="555555"/>
+          <w:sz w:val="22"/>
+          <w:szCs w:val="22"/>
+        </w:rPr>
+        <w:t xml:space="preserve">），确认中文颜色映射来源，然后点击</w:t>
+      </w:r>
+      <w:r>
+        <w:rPr>
+          <w:rFonts w:ascii="Arial" w:cs="Arial" w:eastAsia="Arial" w:hAnsi="Arial"/>
+          <w:b/>
+          <w:bCs/>
+          <w:color w:val="555555"/>
+          <w:sz w:val="22"/>
+          <w:szCs w:val="22"/>
+        </w:rPr>
+        <w:t xml:space="preserve">生成买手计划 + 核料</w:t>
+      </w:r>
+      <w:r>
+        <w:rPr>
+          <w:rFonts w:ascii="Arial" w:cs="Arial" w:eastAsia="Arial" w:hAnsi="Arial"/>
+          <w:b w:val="false"/>
+          <w:bCs w:val="false"/>
+          <w:color w:val="555555"/>
+          <w:sz w:val="22"/>
+          <w:szCs w:val="22"/>
+        </w:rPr>
+        <w:t xml:space="preserve">。</w:t>
+      </w:r>
+    </w:p>
+    <w:p>
+      <w:pPr>
+        <w:pStyle w:val="ListParagraph"/>
+        <w:numPr>
+          <w:ilvl w:val="0"/>
+          <w:numId w:val="3"/>
+        </w:numPr>
+        <w:spacing w:after="60" w:before="60"/>
+      </w:pPr>
+      <w:r>
+        <w:rPr>
+          <w:rFonts w:ascii="Arial" w:cs="Arial" w:eastAsia="Arial" w:hAnsi="Arial"/>
+          <w:b/>
+          <w:bCs/>
+          <w:color w:val="1A1A1A"/>
+          <w:sz w:val="22"/>
+          <w:szCs w:val="22"/>
+        </w:rPr>
+        <w:t xml:space="preserve">Downloads: </w:t>
+      </w:r>
+      <w:r>
+        <w:rPr>
+          <w:rFonts w:ascii="Arial" w:cs="Arial" w:eastAsia="Arial" w:hAnsi="Arial"/>
+          <w:b w:val="false"/>
+          <w:bCs w:val="false"/>
+          <w:color w:val="1A1A1A"/>
+          <w:sz w:val="22"/>
+          <w:szCs w:val="22"/>
+        </w:rPr>
+        <w:t xml:space="preserve">Once generation finishes, download buttons appear for </w:t>
+      </w:r>
+      <w:r>
+        <w:rPr>
+          <w:rFonts w:ascii="Arial" w:cs="Arial" w:eastAsia="Arial" w:hAnsi="Arial"/>
+          <w:b/>
+          <w:bCs/>
+          <w:color w:val="1A1A1A"/>
+          <w:sz w:val="22"/>
+          <w:szCs w:val="22"/>
+        </w:rPr>
+        <w:t xml:space="preserve">Buy Plan (.xlsx)</w:t>
+      </w:r>
+      <w:r>
+        <w:rPr>
+          <w:rFonts w:ascii="Arial" w:cs="Arial" w:eastAsia="Arial" w:hAnsi="Arial"/>
+          <w:b w:val="false"/>
+          <w:bCs w:val="false"/>
+          <w:color w:val="1A1A1A"/>
+          <w:sz w:val="22"/>
+          <w:szCs w:val="22"/>
+        </w:rPr>
+        <w:t xml:space="preserve"> and </w:t>
+      </w:r>
+      <w:r>
+        <w:rPr>
+          <w:rFonts w:ascii="Arial" w:cs="Arial" w:eastAsia="Arial" w:hAnsi="Arial"/>
+          <w:b/>
+          <w:bCs/>
+          <w:color w:val="1A1A1A"/>
+          <w:sz w:val="22"/>
+          <w:szCs w:val="22"/>
+        </w:rPr>
+        <w:t xml:space="preserve">核料 Workbooks (.zip)</w:t>
+      </w:r>
+      <w:r>
+        <w:rPr>
+          <w:rFonts w:ascii="Arial" w:cs="Arial" w:eastAsia="Arial" w:hAnsi="Arial"/>
+          <w:b w:val="false"/>
+          <w:bCs w:val="false"/>
+          <w:color w:val="1A1A1A"/>
+          <w:sz w:val="22"/>
+          <w:szCs w:val="22"/>
+        </w:rPr>
+        <w:t xml:space="preserve">.</w:t>
+      </w:r>
+      <w:r>
+        <w:rPr>
+          <w:rFonts w:ascii="Arial" w:cs="Arial" w:eastAsia="Arial" w:hAnsi="Arial"/>
+          <w:sz w:val="22"/>
+          <w:szCs w:val="22"/>
+        </w:rPr>
+        <w:br/>
+        <w:t xml:space="preserve"/>
+      </w:r>
+      <w:r>
+        <w:rPr>
+          <w:rFonts w:ascii="Arial" w:cs="Arial" w:eastAsia="Arial" w:hAnsi="Arial"/>
+          <w:b/>
+          <w:bCs/>
+          <w:color w:val="555555"/>
+          <w:sz w:val="22"/>
+          <w:szCs w:val="22"/>
+        </w:rPr>
+        <w:t xml:space="preserve">下载：</w:t>
+      </w:r>
+      <w:r>
+        <w:rPr>
+          <w:rFonts w:ascii="Arial" w:cs="Arial" w:eastAsia="Arial" w:hAnsi="Arial"/>
+          <w:b w:val="false"/>
+          <w:bCs w:val="false"/>
+          <w:color w:val="555555"/>
+          <w:sz w:val="22"/>
+          <w:szCs w:val="22"/>
+        </w:rPr>
+        <w:t xml:space="preserve">生成完成后，将显示 </w:t>
+      </w:r>
+      <w:r>
+        <w:rPr>
+          <w:rFonts w:ascii="Arial" w:cs="Arial" w:eastAsia="Arial" w:hAnsi="Arial"/>
+          <w:b/>
+          <w:bCs/>
+          <w:color w:val="555555"/>
+          <w:sz w:val="22"/>
+          <w:szCs w:val="22"/>
+        </w:rPr>
+        <w:t xml:space="preserve">买手计划（.xlsx）</w:t>
+      </w:r>
+      <w:r>
+        <w:rPr>
+          <w:rFonts w:ascii="Arial" w:cs="Arial" w:eastAsia="Arial" w:hAnsi="Arial"/>
+          <w:b w:val="false"/>
+          <w:bCs w:val="false"/>
+          <w:color w:val="555555"/>
+          <w:sz w:val="22"/>
+          <w:szCs w:val="22"/>
+        </w:rPr>
+        <w:t xml:space="preserve">和 </w:t>
+      </w:r>
+      <w:r>
+        <w:rPr>
+          <w:rFonts w:ascii="Arial" w:cs="Arial" w:eastAsia="Arial" w:hAnsi="Arial"/>
+          <w:b/>
+          <w:bCs/>
+          <w:color w:val="555555"/>
+          <w:sz w:val="22"/>
+          <w:szCs w:val="22"/>
+        </w:rPr>
+        <w:t xml:space="preserve">核料工作簿（.zip）</w:t>
+      </w:r>
+      <w:r>
+        <w:rPr>
+          <w:rFonts w:ascii="Arial" w:cs="Arial" w:eastAsia="Arial" w:hAnsi="Arial"/>
+          <w:b w:val="false"/>
+          <w:bCs w:val="false"/>
+          <w:color w:val="555555"/>
+          <w:sz w:val="22"/>
+          <w:szCs w:val="22"/>
+        </w:rPr>
+        <w:t xml:space="preserve"> 的下载按钮。</w:t>
+      </w:r>
+    </w:p>
+    <w:p>
+      <w:pPr>
+        <w:spacing w:after="80" w:before="80"/>
+        <w:jc w:val="left"/>
+      </w:pPr>
+      <w:r>
+        <w:rPr>
+          <w:rFonts w:ascii="Arial" w:cs="Arial" w:eastAsia="Arial" w:hAnsi="Arial"/>
+          <w:color w:val="1A1A1A"/>
+          <w:sz w:val="22"/>
+          <w:szCs w:val="22"/>
+        </w:rPr>
+        <w:t xml:space="preserve">Account Management (Section 5) works exactly the same way — you can still change your password and sign out from the left sidebar.</w:t>
+      </w:r>
+      <w:r>
+        <w:rPr>
+          <w:rFonts w:ascii="Arial" w:cs="Arial" w:eastAsia="Arial" w:hAnsi="Arial"/>
+          <w:sz w:val="22"/>
+          <w:szCs w:val="22"/>
+        </w:rPr>
+        <w:br/>
+        <w:t xml:space="preserve"/>
+      </w:r>
+      <w:r>
+        <w:rPr>
+          <w:rFonts w:ascii="Arial" w:cs="Arial" w:eastAsia="Arial" w:hAnsi="Arial"/>
+          <w:color w:val="555555"/>
+          <w:sz w:val="22"/>
+          <w:szCs w:val="22"/>
+        </w:rPr>
+        <w:t xml:space="preserve">账户管理（第 5 节）的操作方式完全相同——您仍然可以在左侧边栏修改密码和退出登录。</w:t>
+      </w:r>
+    </w:p>
+    <w:p>
+      <w:pPr>
+        <w:spacing w:after="60" w:before="60"/>
+      </w:pPr>
+    </w:p>
+    <w:tbl>
+      <w:tblPr>
+        <w:tblW w:type="dxa" w:w="9746"/>
+        <w:tblBorders>
+          <w:top w:val="single" w:color="auto" w:sz="4"/>
+          <w:left w:val="single" w:color="auto" w:sz="4"/>
+          <w:bottom w:val="single" w:color="auto" w:sz="4"/>
+          <w:right w:val="single" w:color="auto" w:sz="4"/>
+          <w:insideH w:val="single" w:color="auto" w:sz="4"/>
+          <w:insideV w:val="single" w:color="auto" w:sz="4"/>
+        </w:tblBorders>
+      </w:tblPr>
+      <w:tblGrid>
+        <w:gridCol w:w="9746"/>
+      </w:tblGrid>
+      <w:tr>
+        <w:tc>
+          <w:tcPr>
+            <w:tcW w:type="dxa" w:w="9746"/>
+            <w:tcBorders>
+              <w:top w:val="single" w:color="5B9BD5" w:sz="1"/>
+              <w:left w:val="thick" w:color="2C5F8A" w:sz="8"/>
+              <w:bottom w:val="single" w:color="5B9BD5" w:sz="1"/>
+              <w:right w:val="single" w:color="5B9BD5" w:sz="1"/>
+            </w:tcBorders>
+            <w:shd w:fill="EEF4FB" w:val="clear"/>
+            <w:tcMar>
+              <w:top w:type="dxa" w:w="120"/>
+              <w:left w:type="dxa" w:w="200"/>
+              <w:bottom w:type="dxa" w:w="120"/>
+              <w:right w:type="dxa" w:w="200"/>
+            </w:tcMar>
+          </w:tcPr>
+          <w:p>
+            <w:pPr>
+              <w:spacing w:after="0" w:before="0"/>
+            </w:pPr>
+            <w:r>
+              <w:rPr>
+                <w:rFonts w:ascii="Arial" w:cs="Arial" w:eastAsia="Arial" w:hAnsi="Arial"/>
+                <w:b/>
+                <w:bCs/>
+                <w:color w:val="2C5F8A"/>
+                <w:sz w:val="22"/>
+                <w:szCs w:val="22"/>
+              </w:rPr>
+              <w:t xml:space="preserve">Note: </w:t>
+            </w:r>
+            <w:r>
+              <w:rPr>
+                <w:rFonts w:ascii="Arial" w:cs="Arial" w:eastAsia="Arial" w:hAnsi="Arial"/>
+                <w:sz w:val="22"/>
+                <w:szCs w:val="22"/>
+              </w:rPr>
+              <w:t xml:space="preserve">If you need access to Contract History, Missing Fields, or other tabs, contact your administrator to have your account upgraded to a standard Sky East account.</w:t>
+            </w:r>
+            <w:r>
+              <w:rPr>
+                <w:rFonts w:ascii="Arial" w:cs="Arial" w:eastAsia="Arial" w:hAnsi="Arial"/>
+                <w:sz w:val="22"/>
+                <w:szCs w:val="22"/>
+              </w:rPr>
+              <w:br/>
+              <w:t xml:space="preserve"/>
+            </w:r>
+            <w:r>
+              <w:rPr>
+                <w:rFonts w:ascii="Arial" w:cs="Arial" w:eastAsia="Arial" w:hAnsi="Arial"/>
+                <w:b/>
+                <w:bCs/>
+                <w:color w:val="2C5F8A"/>
+                <w:sz w:val="22"/>
+                <w:szCs w:val="22"/>
+              </w:rPr>
+              <w:t xml:space="preserve">注意：</w:t>
+            </w:r>
+            <w:r>
+              <w:rPr>
+                <w:rFonts w:ascii="Arial" w:cs="Arial" w:eastAsia="Arial" w:hAnsi="Arial"/>
+                <w:color w:val="555555"/>
+                <w:sz w:val="22"/>
+                <w:szCs w:val="22"/>
+              </w:rPr>
+              <w:t xml:space="preserve">如果您需要访问合同历史、缺失字段或其他标签页，请联系管理员将您的账户升级为标准 Sky East 账户。</w:t>
+            </w:r>
+          </w:p>
+        </w:tc>
+      </w:tr>
+    </w:tbl>
     <w:p>
       <w:pPr>
         <w:spacing w:after="60" w:before="60"/>

</xml_diff>